<commit_message>
feat: update technical report, remove syllabus rubric, and enhance README portfolio documentation
</commit_message>
<xml_diff>
--- a/docs/IoT_Smart_Parking_Safety_Report.docx
+++ b/docs/IoT_Smart_Parking_Safety_Report.docx
@@ -2,632 +2,7 @@
 <file path=word/document.xml><?xml version="1.0" encoding="utf-8"?>
 <w:document xmlns:wpc="http://schemas.microsoft.com/office/word/2010/wordprocessingCanvas" xmlns:cx="http://schemas.microsoft.com/office/drawing/2014/chartex" xmlns:cx1="http://schemas.microsoft.com/office/drawing/2015/9/8/chartex" xmlns:cx2="http://schemas.microsoft.com/office/drawing/2015/10/21/chartex" xmlns:cx3="http://schemas.microsoft.com/office/drawing/2016/5/9/chartex" xmlns:cx4="http://schemas.microsoft.com/office/drawing/2016/5/10/chartex" xmlns:cx5="http://schemas.microsoft.com/office/drawing/2016/5/11/chartex" xmlns:cx6="http://schemas.microsoft.com/office/drawing/2016/5/12/chartex" xmlns:cx7="http://schemas.microsoft.com/office/drawing/2016/5/13/chartex" xmlns:cx8="http://schemas.microsoft.com/office/drawing/2016/5/14/chartex" xmlns:mc="http://schemas.openxmlformats.org/markup-compatibility/2006" xmlns:o="urn:schemas-microsoft-com:office:office" xmlns:r="http://schemas.openxmlformats.org/officeDocument/2006/relationships" xmlns:m="http://schemas.openxmlformats.org/officeDocument/2006/math" xmlns:v="urn:schemas-microsoft-com:vml" xmlns:wp14="http://schemas.microsoft.com/office/word/2010/wordprocessingDrawing" xmlns:wp="http://schemas.openxmlformats.org/drawingml/2006/wordprocessingDrawing" xmlns:w="http://schemas.openxmlformats.org/wordprocessingml/2006/main" xmlns:w14="http://schemas.microsoft.com/office/word/2010/wordml" xmlns:w10="urn:schemas-microsoft-com:office:word" xmlns:w15="http://schemas.microsoft.com/office/word/2012/wordml" xmlns:wpg="http://schemas.microsoft.com/office/word/2010/wordprocessingGroup" xmlns:wpi="http://schemas.microsoft.com/office/word/2010/wordprocessingInk" xmlns:wne="http://schemas.microsoft.com/office/word/2006/wordml" xmlns:wps="http://schemas.microsoft.com/office/word/2010/wordprocessingShape" xmlns:wpsCustomData="http://www.wps.cn/officeDocument/2013/wpsCustomData" mc:Ignorable="w14 w15 wp14">
   <w:body>
-    <w:p>
-      <w:pPr>
-        <w:spacing w:before="1440"/>
-      </w:pPr>
-    </w:p>
-    <w:p>
-      <w:pPr>
-        <w:spacing w:after="200"/>
-        <w:jc w:val="center"/>
-      </w:pPr>
-      <w:r>
-        <w:rPr>
-          <w:rFonts w:ascii="Times New Roman" w:hAnsi="Times New Roman" w:eastAsia="Times New Roman" w:cs="Times New Roman"/>
-          <w:b/>
-          <w:bCs/>
-          <w:sz w:val="26"/>
-          <w:szCs w:val="26"/>
-        </w:rPr>
-        <w:t>SVKM's Shri Bhagubhai Mafatlal Polytechnic</w:t>
-      </w:r>
-    </w:p>
-    <w:p>
-      <w:pPr>
-        <w:spacing w:after="200"/>
-        <w:jc w:val="center"/>
-      </w:pPr>
-      <w:r>
-        <w:rPr>
-          <w:rFonts w:ascii="Times New Roman" w:hAnsi="Times New Roman" w:eastAsia="Times New Roman" w:cs="Times New Roman"/>
-          <w:sz w:val="24"/>
-          <w:szCs w:val="24"/>
-        </w:rPr>
-        <w:t>Department of Computer Engineering</w:t>
-      </w:r>
-    </w:p>
-    <w:p>
-      <w:pPr>
-        <w:spacing w:after="400"/>
-        <w:jc w:val="center"/>
-      </w:pPr>
-      <w:r>
-        <w:rPr>
-          <w:rFonts w:ascii="Times New Roman" w:hAnsi="Times New Roman" w:eastAsia="Times New Roman" w:cs="Times New Roman"/>
-          <w:sz w:val="24"/>
-          <w:szCs w:val="24"/>
-        </w:rPr>
-        <w:t>Academic Year: 2026 – 2027</w:t>
-      </w:r>
-    </w:p>
-    <w:p>
-      <w:pPr>
-        <w:spacing w:after="160"/>
-        <w:jc w:val="center"/>
-      </w:pPr>
-      <w:r>
-        <w:rPr>
-          <w:rFonts w:ascii="Times New Roman" w:hAnsi="Times New Roman" w:eastAsia="Times New Roman" w:cs="Times New Roman"/>
-          <w:sz w:val="24"/>
-          <w:szCs w:val="24"/>
-        </w:rPr>
-        <w:t>Experiment No.: 11</w:t>
-      </w:r>
-    </w:p>
-    <w:p>
-      <w:pPr>
-        <w:spacing w:after="560"/>
-        <w:jc w:val="center"/>
-      </w:pPr>
-      <w:r>
-        <w:rPr>
-          <w:rFonts w:ascii="Times New Roman" w:hAnsi="Times New Roman" w:eastAsia="Times New Roman" w:cs="Times New Roman"/>
-          <w:b/>
-          <w:bCs/>
-          <w:sz w:val="26"/>
-          <w:szCs w:val="26"/>
-          <w:u w:val="single"/>
-        </w:rPr>
-        <w:t>Case Study on IoT Applications for Industry</w:t>
-      </w:r>
-    </w:p>
-    <w:p>
-      <w:pPr>
-        <w:spacing w:after="160"/>
-        <w:jc w:val="center"/>
-      </w:pPr>
-      <w:r>
-        <w:rPr>
-          <w:rFonts w:ascii="Times New Roman" w:hAnsi="Times New Roman" w:eastAsia="Times New Roman" w:cs="Times New Roman"/>
-          <w:b/>
-          <w:bCs/>
-          <w:sz w:val="24"/>
-          <w:szCs w:val="24"/>
-        </w:rPr>
-        <w:t>Project Title:</w:t>
-      </w:r>
-    </w:p>
-    <w:p>
-      <w:pPr>
-        <w:spacing w:after="560"/>
-        <w:jc w:val="center"/>
-      </w:pPr>
-      <w:r>
-        <w:rPr>
-          <w:rFonts w:ascii="Times New Roman" w:hAnsi="Times New Roman" w:eastAsia="Times New Roman" w:cs="Times New Roman"/>
-          <w:b/>
-          <w:bCs/>
-          <w:sz w:val="28"/>
-          <w:szCs w:val="28"/>
-        </w:rPr>
-        <w:t>IoT-Based Smart Parking Safety System Using Raspberry Pi</w:t>
-      </w:r>
-    </w:p>
-    <w:tbl>
-      <w:tblPr>
-        <w:tblStyle w:val="10"/>
-        <w:tblW w:w="8369" w:type="dxa"/>
-        <w:tblInd w:w="0" w:type="dxa"/>
-        <w:tblBorders>
-          <w:top w:val="single" w:color="auto" w:sz="4" w:space="0"/>
-          <w:left w:val="single" w:color="auto" w:sz="4" w:space="0"/>
-          <w:bottom w:val="single" w:color="auto" w:sz="4" w:space="0"/>
-          <w:right w:val="single" w:color="auto" w:sz="4" w:space="0"/>
-          <w:insideH w:val="single" w:color="auto" w:sz="4" w:space="0"/>
-          <w:insideV w:val="single" w:color="auto" w:sz="4" w:space="0"/>
-        </w:tblBorders>
-        <w:tblLayout w:type="autofit"/>
-        <w:tblCellMar>
-          <w:top w:w="0" w:type="dxa"/>
-          <w:left w:w="10" w:type="dxa"/>
-          <w:bottom w:w="0" w:type="dxa"/>
-          <w:right w:w="10" w:type="dxa"/>
-        </w:tblCellMar>
-      </w:tblPr>
-      <w:tblGrid>
-        <w:gridCol w:w="3600"/>
-        <w:gridCol w:w="4769"/>
-      </w:tblGrid>
-      <w:tr>
-        <w:tblPrEx>
-          <w:tblBorders>
-            <w:top w:val="single" w:color="auto" w:sz="4" w:space="0"/>
-            <w:left w:val="single" w:color="auto" w:sz="4" w:space="0"/>
-            <w:bottom w:val="single" w:color="auto" w:sz="4" w:space="0"/>
-            <w:right w:val="single" w:color="auto" w:sz="4" w:space="0"/>
-            <w:insideH w:val="single" w:color="auto" w:sz="4" w:space="0"/>
-            <w:insideV w:val="single" w:color="auto" w:sz="4" w:space="0"/>
-          </w:tblBorders>
-        </w:tblPrEx>
-        <w:tc>
-          <w:tcPr>
-            <w:tcW w:w="3600" w:type="dxa"/>
-            <w:tcBorders>
-              <w:top w:val="single" w:color="000000" w:sz="6" w:space="0"/>
-              <w:left w:val="single" w:color="000000" w:sz="6" w:space="0"/>
-              <w:bottom w:val="single" w:color="000000" w:sz="6" w:space="0"/>
-              <w:right w:val="single" w:color="000000" w:sz="6" w:space="0"/>
-            </w:tcBorders>
-            <w:shd w:val="clear" w:color="auto" w:fill="BDD7EE"/>
-            <w:tcMar>
-              <w:top w:w="80" w:type="dxa"/>
-              <w:left w:w="120" w:type="dxa"/>
-              <w:bottom w:w="80" w:type="dxa"/>
-              <w:right w:w="120" w:type="dxa"/>
-            </w:tcMar>
-          </w:tcPr>
-          <w:p>
-            <w:pPr>
-              <w:jc w:val="center"/>
-            </w:pPr>
-            <w:r>
-              <w:rPr>
-                <w:rFonts w:ascii="Times New Roman" w:hAnsi="Times New Roman" w:eastAsia="Times New Roman" w:cs="Times New Roman"/>
-                <w:b/>
-                <w:bCs/>
-                <w:sz w:val="22"/>
-                <w:szCs w:val="22"/>
-              </w:rPr>
-              <w:t>Field</w:t>
-            </w:r>
-          </w:p>
-        </w:tc>
-        <w:tc>
-          <w:tcPr>
-            <w:tcW w:w="4769" w:type="dxa"/>
-            <w:tcBorders>
-              <w:top w:val="single" w:color="000000" w:sz="6" w:space="0"/>
-              <w:left w:val="single" w:color="000000" w:sz="6" w:space="0"/>
-              <w:bottom w:val="single" w:color="000000" w:sz="6" w:space="0"/>
-              <w:right w:val="single" w:color="000000" w:sz="6" w:space="0"/>
-            </w:tcBorders>
-            <w:shd w:val="clear" w:color="auto" w:fill="BDD7EE"/>
-            <w:tcMar>
-              <w:top w:w="80" w:type="dxa"/>
-              <w:left w:w="120" w:type="dxa"/>
-              <w:bottom w:w="80" w:type="dxa"/>
-              <w:right w:w="120" w:type="dxa"/>
-            </w:tcMar>
-          </w:tcPr>
-          <w:p>
-            <w:pPr>
-              <w:jc w:val="center"/>
-            </w:pPr>
-            <w:r>
-              <w:rPr>
-                <w:rFonts w:ascii="Times New Roman" w:hAnsi="Times New Roman" w:eastAsia="Times New Roman" w:cs="Times New Roman"/>
-                <w:b/>
-                <w:bCs/>
-                <w:sz w:val="22"/>
-                <w:szCs w:val="22"/>
-              </w:rPr>
-              <w:t>Details</w:t>
-            </w:r>
-          </w:p>
-        </w:tc>
-      </w:tr>
-      <w:tr>
-        <w:tblPrEx>
-          <w:tblBorders>
-            <w:top w:val="single" w:color="auto" w:sz="4" w:space="0"/>
-            <w:left w:val="single" w:color="auto" w:sz="4" w:space="0"/>
-            <w:bottom w:val="single" w:color="auto" w:sz="4" w:space="0"/>
-            <w:right w:val="single" w:color="auto" w:sz="4" w:space="0"/>
-            <w:insideH w:val="single" w:color="auto" w:sz="4" w:space="0"/>
-            <w:insideV w:val="single" w:color="auto" w:sz="4" w:space="0"/>
-          </w:tblBorders>
-          <w:tblCellMar>
-            <w:top w:w="0" w:type="dxa"/>
-            <w:left w:w="10" w:type="dxa"/>
-            <w:bottom w:w="0" w:type="dxa"/>
-            <w:right w:w="10" w:type="dxa"/>
-          </w:tblCellMar>
-        </w:tblPrEx>
-        <w:tc>
-          <w:tcPr>
-            <w:tcW w:w="3600" w:type="dxa"/>
-            <w:tcBorders>
-              <w:top w:val="single" w:color="000000" w:sz="6" w:space="0"/>
-              <w:left w:val="single" w:color="000000" w:sz="6" w:space="0"/>
-              <w:bottom w:val="single" w:color="000000" w:sz="6" w:space="0"/>
-              <w:right w:val="single" w:color="000000" w:sz="6" w:space="0"/>
-            </w:tcBorders>
-            <w:tcMar>
-              <w:top w:w="80" w:type="dxa"/>
-              <w:left w:w="120" w:type="dxa"/>
-              <w:bottom w:w="80" w:type="dxa"/>
-              <w:right w:w="120" w:type="dxa"/>
-            </w:tcMar>
-          </w:tcPr>
-          <w:p>
-            <w:pPr>
-              <w:jc w:val="both"/>
-            </w:pPr>
-            <w:r>
-              <w:rPr>
-                <w:rFonts w:ascii="Times New Roman" w:hAnsi="Times New Roman" w:eastAsia="Times New Roman" w:cs="Times New Roman"/>
-                <w:sz w:val="22"/>
-                <w:szCs w:val="22"/>
-              </w:rPr>
-              <w:t>Subject</w:t>
-            </w:r>
-          </w:p>
-        </w:tc>
-        <w:tc>
-          <w:tcPr>
-            <w:tcW w:w="4769" w:type="dxa"/>
-            <w:tcBorders>
-              <w:top w:val="single" w:color="000000" w:sz="6" w:space="0"/>
-              <w:left w:val="single" w:color="000000" w:sz="6" w:space="0"/>
-              <w:bottom w:val="single" w:color="000000" w:sz="6" w:space="0"/>
-              <w:right w:val="single" w:color="000000" w:sz="6" w:space="0"/>
-            </w:tcBorders>
-            <w:tcMar>
-              <w:top w:w="80" w:type="dxa"/>
-              <w:left w:w="120" w:type="dxa"/>
-              <w:bottom w:w="80" w:type="dxa"/>
-              <w:right w:w="120" w:type="dxa"/>
-            </w:tcMar>
-          </w:tcPr>
-          <w:p>
-            <w:pPr>
-              <w:jc w:val="both"/>
-            </w:pPr>
-            <w:r>
-              <w:rPr>
-                <w:rFonts w:ascii="Times New Roman" w:hAnsi="Times New Roman" w:eastAsia="Times New Roman" w:cs="Times New Roman"/>
-                <w:sz w:val="22"/>
-                <w:szCs w:val="22"/>
-              </w:rPr>
-              <w:t>Internet of Things (IoT)</w:t>
-            </w:r>
-          </w:p>
-        </w:tc>
-      </w:tr>
-      <w:tr>
-        <w:tblPrEx>
-          <w:tblBorders>
-            <w:top w:val="single" w:color="auto" w:sz="4" w:space="0"/>
-            <w:left w:val="single" w:color="auto" w:sz="4" w:space="0"/>
-            <w:bottom w:val="single" w:color="auto" w:sz="4" w:space="0"/>
-            <w:right w:val="single" w:color="auto" w:sz="4" w:space="0"/>
-            <w:insideH w:val="single" w:color="auto" w:sz="4" w:space="0"/>
-            <w:insideV w:val="single" w:color="auto" w:sz="4" w:space="0"/>
-          </w:tblBorders>
-          <w:tblCellMar>
-            <w:top w:w="0" w:type="dxa"/>
-            <w:left w:w="10" w:type="dxa"/>
-            <w:bottom w:w="0" w:type="dxa"/>
-            <w:right w:w="10" w:type="dxa"/>
-          </w:tblCellMar>
-        </w:tblPrEx>
-        <w:trPr>
-          <w:trHeight w:val="541" w:hRule="atLeast"/>
-        </w:trPr>
-        <w:tc>
-          <w:tcPr>
-            <w:tcW w:w="3600" w:type="dxa"/>
-            <w:tcBorders>
-              <w:top w:val="single" w:color="000000" w:sz="6" w:space="0"/>
-              <w:left w:val="single" w:color="000000" w:sz="6" w:space="0"/>
-              <w:bottom w:val="single" w:color="000000" w:sz="6" w:space="0"/>
-              <w:right w:val="single" w:color="000000" w:sz="6" w:space="0"/>
-            </w:tcBorders>
-            <w:tcMar>
-              <w:top w:w="80" w:type="dxa"/>
-              <w:left w:w="120" w:type="dxa"/>
-              <w:bottom w:w="80" w:type="dxa"/>
-              <w:right w:w="120" w:type="dxa"/>
-            </w:tcMar>
-          </w:tcPr>
-          <w:p>
-            <w:pPr>
-              <w:jc w:val="both"/>
-            </w:pPr>
-            <w:r>
-              <w:rPr>
-                <w:rFonts w:ascii="Times New Roman" w:hAnsi="Times New Roman" w:eastAsia="Times New Roman" w:cs="Times New Roman"/>
-                <w:sz w:val="22"/>
-                <w:szCs w:val="22"/>
-              </w:rPr>
-              <w:t>Submitted By</w:t>
-            </w:r>
-          </w:p>
-        </w:tc>
-        <w:tc>
-          <w:tcPr>
-            <w:tcW w:w="4769" w:type="dxa"/>
-            <w:tcBorders>
-              <w:top w:val="single" w:color="000000" w:sz="6" w:space="0"/>
-              <w:left w:val="single" w:color="000000" w:sz="6" w:space="0"/>
-              <w:bottom w:val="single" w:color="000000" w:sz="6" w:space="0"/>
-              <w:right w:val="single" w:color="000000" w:sz="6" w:space="0"/>
-            </w:tcBorders>
-            <w:tcMar>
-              <w:top w:w="80" w:type="dxa"/>
-              <w:left w:w="120" w:type="dxa"/>
-              <w:bottom w:w="80" w:type="dxa"/>
-              <w:right w:w="120" w:type="dxa"/>
-            </w:tcMar>
-          </w:tcPr>
-          <w:p>
-            <w:pPr>
-              <w:jc w:val="both"/>
-              <w:rPr>
-                <w:rFonts w:hint="default"/>
-                <w:lang w:val="en-IN"/>
-              </w:rPr>
-            </w:pPr>
-            <w:r>
-              <w:rPr>
-                <w:rFonts w:ascii="Times New Roman" w:hAnsi="Times New Roman" w:eastAsia="Times New Roman" w:cs="Times New Roman"/>
-                <w:sz w:val="22"/>
-                <w:szCs w:val="22"/>
-              </w:rPr>
-              <w:t>Ayush</w:t>
-            </w:r>
-            <w:r>
-              <w:rPr>
-                <w:rFonts w:hint="default" w:cs="Times New Roman"/>
-                <w:sz w:val="22"/>
-                <w:szCs w:val="22"/>
-                <w:lang w:val="en-IN"/>
-              </w:rPr>
-              <w:t xml:space="preserve"> </w:t>
-            </w:r>
-            <w:r>
-              <w:rPr>
-                <w:rFonts w:ascii="Times New Roman" w:hAnsi="Times New Roman" w:eastAsia="Times New Roman" w:cs="Times New Roman"/>
-                <w:sz w:val="22"/>
-                <w:szCs w:val="22"/>
-              </w:rPr>
-              <w:t>Barve</w:t>
-            </w:r>
-            <w:r>
-              <w:rPr>
-                <w:rFonts w:hint="default" w:cs="Times New Roman"/>
-                <w:sz w:val="22"/>
-                <w:szCs w:val="22"/>
-                <w:lang w:val="en-IN"/>
-              </w:rPr>
-              <w:t>,</w:t>
-            </w:r>
-            <w:r>
-              <w:rPr>
-                <w:rFonts w:hint="default" w:cs="Times New Roman"/>
-                <w:sz w:val="22"/>
-                <w:szCs w:val="22"/>
-                <w:lang w:val="en-US"/>
-              </w:rPr>
-              <w:t xml:space="preserve"> </w:t>
-            </w:r>
-            <w:r>
-              <w:rPr>
-                <w:rFonts w:hint="default" w:cs="Times New Roman"/>
-                <w:sz w:val="22"/>
-                <w:szCs w:val="22"/>
-                <w:lang w:val="en-IN"/>
-              </w:rPr>
-              <w:t>Arif Choudhary, Vivaan Shah</w:t>
-            </w:r>
-            <w:r>
-              <w:rPr>
-                <w:rFonts w:hint="default" w:cs="Times New Roman"/>
-                <w:sz w:val="22"/>
-                <w:szCs w:val="22"/>
-                <w:lang w:val="en-US"/>
-              </w:rPr>
-              <w:t>,</w:t>
-            </w:r>
-            <w:bookmarkStart w:id="0" w:name="_GoBack"/>
-            <w:bookmarkEnd w:id="0"/>
-            <w:r>
-              <w:rPr>
-                <w:rFonts w:hint="default" w:cs="Times New Roman"/>
-                <w:sz w:val="22"/>
-                <w:szCs w:val="22"/>
-                <w:lang w:val="en-IN"/>
-              </w:rPr>
-              <w:t>,Jaival Prajapati , Rushabh Pandya , Aditya Shah</w:t>
-            </w:r>
-          </w:p>
-        </w:tc>
-      </w:tr>
-      <w:tr>
-        <w:tblPrEx>
-          <w:tblBorders>
-            <w:top w:val="single" w:color="auto" w:sz="4" w:space="0"/>
-            <w:left w:val="single" w:color="auto" w:sz="4" w:space="0"/>
-            <w:bottom w:val="single" w:color="auto" w:sz="4" w:space="0"/>
-            <w:right w:val="single" w:color="auto" w:sz="4" w:space="0"/>
-            <w:insideH w:val="single" w:color="auto" w:sz="4" w:space="0"/>
-            <w:insideV w:val="single" w:color="auto" w:sz="4" w:space="0"/>
-          </w:tblBorders>
-          <w:tblCellMar>
-            <w:top w:w="0" w:type="dxa"/>
-            <w:left w:w="10" w:type="dxa"/>
-            <w:bottom w:w="0" w:type="dxa"/>
-            <w:right w:w="10" w:type="dxa"/>
-          </w:tblCellMar>
-        </w:tblPrEx>
-        <w:tc>
-          <w:tcPr>
-            <w:tcW w:w="3600" w:type="dxa"/>
-            <w:tcBorders>
-              <w:top w:val="single" w:color="000000" w:sz="6" w:space="0"/>
-              <w:left w:val="single" w:color="000000" w:sz="6" w:space="0"/>
-              <w:bottom w:val="single" w:color="000000" w:sz="6" w:space="0"/>
-              <w:right w:val="single" w:color="000000" w:sz="6" w:space="0"/>
-            </w:tcBorders>
-            <w:tcMar>
-              <w:top w:w="80" w:type="dxa"/>
-              <w:left w:w="120" w:type="dxa"/>
-              <w:bottom w:w="80" w:type="dxa"/>
-              <w:right w:w="120" w:type="dxa"/>
-            </w:tcMar>
-          </w:tcPr>
-          <w:p>
-            <w:pPr>
-              <w:jc w:val="both"/>
-            </w:pPr>
-            <w:r>
-              <w:rPr>
-                <w:rFonts w:ascii="Times New Roman" w:hAnsi="Times New Roman" w:eastAsia="Times New Roman" w:cs="Times New Roman"/>
-                <w:sz w:val="22"/>
-                <w:szCs w:val="22"/>
-              </w:rPr>
-              <w:t>Roll No.</w:t>
-            </w:r>
-          </w:p>
-        </w:tc>
-        <w:tc>
-          <w:tcPr>
-            <w:tcW w:w="4769" w:type="dxa"/>
-            <w:tcBorders>
-              <w:top w:val="single" w:color="000000" w:sz="6" w:space="0"/>
-              <w:left w:val="single" w:color="000000" w:sz="6" w:space="0"/>
-              <w:bottom w:val="single" w:color="000000" w:sz="6" w:space="0"/>
-              <w:right w:val="single" w:color="000000" w:sz="6" w:space="0"/>
-            </w:tcBorders>
-            <w:tcMar>
-              <w:top w:w="80" w:type="dxa"/>
-              <w:left w:w="120" w:type="dxa"/>
-              <w:bottom w:w="80" w:type="dxa"/>
-              <w:right w:w="120" w:type="dxa"/>
-            </w:tcMar>
-          </w:tcPr>
-          <w:p>
-            <w:pPr>
-              <w:jc w:val="both"/>
-              <w:rPr>
-                <w:rFonts w:hint="default"/>
-                <w:lang w:val="en-IN"/>
-              </w:rPr>
-            </w:pPr>
-            <w:r>
-              <w:rPr>
-                <w:rFonts w:ascii="Times New Roman" w:hAnsi="Times New Roman" w:eastAsia="Times New Roman" w:cs="Times New Roman"/>
-                <w:sz w:val="22"/>
-                <w:szCs w:val="22"/>
-              </w:rPr>
-              <w:t xml:space="preserve">B066 </w:t>
-            </w:r>
-            <w:r>
-              <w:rPr>
-                <w:rFonts w:hint="default" w:cs="Times New Roman"/>
-                <w:sz w:val="22"/>
-                <w:szCs w:val="22"/>
-                <w:lang w:val="en-IN"/>
-              </w:rPr>
-              <w:t xml:space="preserve">, B065, B057 , B064 , B039 , B050 </w:t>
-            </w:r>
-          </w:p>
-        </w:tc>
-      </w:tr>
-      <w:tr>
-        <w:tblPrEx>
-          <w:tblBorders>
-            <w:top w:val="single" w:color="auto" w:sz="4" w:space="0"/>
-            <w:left w:val="single" w:color="auto" w:sz="4" w:space="0"/>
-            <w:bottom w:val="single" w:color="auto" w:sz="4" w:space="0"/>
-            <w:right w:val="single" w:color="auto" w:sz="4" w:space="0"/>
-            <w:insideH w:val="single" w:color="auto" w:sz="4" w:space="0"/>
-            <w:insideV w:val="single" w:color="auto" w:sz="4" w:space="0"/>
-          </w:tblBorders>
-          <w:tblCellMar>
-            <w:top w:w="0" w:type="dxa"/>
-            <w:left w:w="10" w:type="dxa"/>
-            <w:bottom w:w="0" w:type="dxa"/>
-            <w:right w:w="10" w:type="dxa"/>
-          </w:tblCellMar>
-        </w:tblPrEx>
-        <w:tc>
-          <w:tcPr>
-            <w:tcW w:w="3600" w:type="dxa"/>
-            <w:tcBorders>
-              <w:top w:val="single" w:color="000000" w:sz="6" w:space="0"/>
-              <w:left w:val="single" w:color="000000" w:sz="6" w:space="0"/>
-              <w:bottom w:val="single" w:color="000000" w:sz="6" w:space="0"/>
-              <w:right w:val="single" w:color="000000" w:sz="6" w:space="0"/>
-            </w:tcBorders>
-            <w:tcMar>
-              <w:top w:w="80" w:type="dxa"/>
-              <w:left w:w="120" w:type="dxa"/>
-              <w:bottom w:w="80" w:type="dxa"/>
-              <w:right w:w="120" w:type="dxa"/>
-            </w:tcMar>
-          </w:tcPr>
-          <w:p>
-            <w:pPr>
-              <w:jc w:val="both"/>
-            </w:pPr>
-            <w:r>
-              <w:rPr>
-                <w:rFonts w:ascii="Times New Roman" w:hAnsi="Times New Roman" w:eastAsia="Times New Roman" w:cs="Times New Roman"/>
-                <w:sz w:val="22"/>
-                <w:szCs w:val="22"/>
-              </w:rPr>
-              <w:t>Date</w:t>
-            </w:r>
-          </w:p>
-        </w:tc>
-        <w:tc>
-          <w:tcPr>
-            <w:tcW w:w="4769" w:type="dxa"/>
-            <w:tcBorders>
-              <w:top w:val="single" w:color="000000" w:sz="6" w:space="0"/>
-              <w:left w:val="single" w:color="000000" w:sz="6" w:space="0"/>
-              <w:bottom w:val="single" w:color="000000" w:sz="6" w:space="0"/>
-              <w:right w:val="single" w:color="000000" w:sz="6" w:space="0"/>
-            </w:tcBorders>
-            <w:tcMar>
-              <w:top w:w="80" w:type="dxa"/>
-              <w:left w:w="120" w:type="dxa"/>
-              <w:bottom w:w="80" w:type="dxa"/>
-              <w:right w:w="120" w:type="dxa"/>
-            </w:tcMar>
-          </w:tcPr>
-          <w:p>
-            <w:pPr>
-              <w:jc w:val="both"/>
-            </w:pPr>
-            <w:r>
-              <w:rPr>
-                <w:rFonts w:hint="default" w:cs="Times New Roman"/>
-                <w:sz w:val="22"/>
-                <w:szCs w:val="22"/>
-                <w:lang w:val="en-IN"/>
-              </w:rPr>
-              <w:t xml:space="preserve">20 </w:t>
-            </w:r>
-            <w:r>
-              <w:rPr>
-                <w:rFonts w:ascii="Times New Roman" w:hAnsi="Times New Roman" w:eastAsia="Times New Roman" w:cs="Times New Roman"/>
-                <w:sz w:val="22"/>
-                <w:szCs w:val="22"/>
-              </w:rPr>
-              <w:t>April 2026</w:t>
-            </w:r>
-          </w:p>
-        </w:tc>
-      </w:tr>
-    </w:tbl>
-    <w:p>
-      <w:r>
-        <w:br w:type="page"/>
-      </w:r>
-    </w:p>
+    <w:p/>
     <w:p>
       <w:pPr>
         <w:pStyle w:val="2"/>
@@ -637,6 +12,8 @@
         </w:numPr>
         <w:spacing w:before="240" w:after="120"/>
       </w:pPr>
+      <w:bookmarkStart w:id="0" w:name="_GoBack"/>
+      <w:bookmarkEnd w:id="0"/>
       <w:r>
         <w:rPr>
           <w:rFonts w:hint="default" w:cs="Times New Roman"/>
@@ -1286,12 +663,6 @@
             <w:insideH w:val="single" w:color="auto" w:sz="4" w:space="0"/>
             <w:insideV w:val="single" w:color="auto" w:sz="4" w:space="0"/>
           </w:tblBorders>
-          <w:tblCellMar>
-            <w:top w:w="0" w:type="dxa"/>
-            <w:left w:w="10" w:type="dxa"/>
-            <w:bottom w:w="0" w:type="dxa"/>
-            <w:right w:w="10" w:type="dxa"/>
-          </w:tblCellMar>
         </w:tblPrEx>
         <w:tc>
           <w:tcPr>

</xml_diff>